<commit_message>
cambiar documentos del prototipo de lugar. Incluir documento del formato de entrega. Modificar el Doc1 sobre casos de uso prioritarios.
</commit_message>
<xml_diff>
--- a/Entregas/Primera entrega/Formato Entrega 1 Proyecto.docx
+++ b/Entregas/Primera entrega/Formato Entrega 1 Proyecto.docx
@@ -1,6 +1,6 @@
 
 <file path=word/document.xml><?xml version="1.0" encoding="utf-8"?>
-<w:document xmlns:wpc="http://schemas.microsoft.com/office/word/2010/wordprocessingCanvas" xmlns:cx="http://schemas.microsoft.com/office/drawing/2014/chartex" xmlns:cx1="http://schemas.microsoft.com/office/drawing/2015/9/8/chartex" xmlns:cx2="http://schemas.microsoft.com/office/drawing/2015/10/21/chartex" xmlns:cx3="http://schemas.microsoft.com/office/drawing/2016/5/9/chartex" xmlns:cx4="http://schemas.microsoft.com/office/drawing/2016/5/10/chartex" xmlns:cx5="http://schemas.microsoft.com/office/drawing/2016/5/11/chartex" xmlns:cx6="http://schemas.microsoft.com/office/drawing/2016/5/12/chartex" xmlns:cx7="http://schemas.microsoft.com/office/drawing/2016/5/13/chartex" xmlns:cx8="http://schemas.microsoft.com/office/drawing/2016/5/14/chartex" xmlns:mc="http://schemas.openxmlformats.org/markup-compatibility/2006" xmlns:aink="http://schemas.microsoft.com/office/drawing/2016/ink" xmlns:am3d="http://schemas.microsoft.com/office/drawing/2017/model3d" xmlns:o="urn:schemas-microsoft-com:office:office" xmlns:oel="http://schemas.microsoft.com/office/2019/extlst" xmlns:r="http://schemas.openxmlformats.org/officeDocument/2006/relationships" xmlns:m="http://schemas.openxmlformats.org/officeDocument/2006/math" xmlns:v="urn:schemas-microsoft-com:vml" xmlns:wp14="http://schemas.microsoft.com/office/word/2010/wordprocessingDrawing" xmlns:wp="http://schemas.openxmlformats.org/drawingml/2006/wordprocessingDrawing" xmlns:w10="urn:schemas-microsoft-com:office:word" xmlns:w="http://schemas.openxmlformats.org/wordprocessingml/2006/main" xmlns:w14="http://schemas.microsoft.com/office/word/2010/wordml" xmlns:w15="http://schemas.microsoft.com/office/word/2012/wordml" xmlns:w16cex="http://schemas.microsoft.com/office/word/2018/wordml/cex" xmlns:w16cid="http://schemas.microsoft.com/office/word/2016/wordml/cid" xmlns:w16="http://schemas.microsoft.com/office/word/2018/wordml" xmlns:w16du="http://schemas.microsoft.com/office/word/2023/wordml/word16du" xmlns:w16sdtdh="http://schemas.microsoft.com/office/word/2020/wordml/sdtdatahash" xmlns:w16sdtfl="http://schemas.microsoft.com/office/word/2024/wordml/sdtformatlock" xmlns:w16se="http://schemas.microsoft.com/office/word/2015/wordml/symex" xmlns:wpg="http://schemas.microsoft.com/office/word/2010/wordprocessingGroup" xmlns:wpi="http://schemas.microsoft.com/office/word/2010/wordprocessingInk" xmlns:wne="http://schemas.microsoft.com/office/word/2006/wordml" xmlns:wps="http://schemas.microsoft.com/office/word/2010/wordprocessingShape" mc:Ignorable="w14 w15 w16se w16cid w16 w16cex w16sdtdh w16sdtfl w16du wp14">
+<w:document xmlns:wpc="http://schemas.microsoft.com/office/word/2010/wordprocessingCanvas" xmlns:cx="http://schemas.microsoft.com/office/drawing/2014/chartex" xmlns:cx1="http://schemas.microsoft.com/office/drawing/2015/9/8/chartex" xmlns:cx2="http://schemas.microsoft.com/office/drawing/2015/10/21/chartex" xmlns:cx3="http://schemas.microsoft.com/office/drawing/2016/5/9/chartex" xmlns:cx4="http://schemas.microsoft.com/office/drawing/2016/5/10/chartex" xmlns:cx5="http://schemas.microsoft.com/office/drawing/2016/5/11/chartex" xmlns:cx6="http://schemas.microsoft.com/office/drawing/2016/5/12/chartex" xmlns:cx7="http://schemas.microsoft.com/office/drawing/2016/5/13/chartex" xmlns:cx8="http://schemas.microsoft.com/office/drawing/2016/5/14/chartex" xmlns:mc="http://schemas.openxmlformats.org/markup-compatibility/2006" xmlns:aink="http://schemas.microsoft.com/office/drawing/2016/ink" xmlns:am3d="http://schemas.microsoft.com/office/drawing/2017/model3d" xmlns:o="urn:schemas-microsoft-com:office:office" xmlns:r="http://schemas.openxmlformats.org/officeDocument/2006/relationships" xmlns:m="http://schemas.openxmlformats.org/officeDocument/2006/math" xmlns:v="urn:schemas-microsoft-com:vml" xmlns:wp14="http://schemas.microsoft.com/office/word/2010/wordprocessingDrawing" xmlns:wp="http://schemas.openxmlformats.org/drawingml/2006/wordprocessingDrawing" xmlns:w10="urn:schemas-microsoft-com:office:word" xmlns:w="http://schemas.openxmlformats.org/wordprocessingml/2006/main" xmlns:w14="http://schemas.microsoft.com/office/word/2010/wordml" xmlns:w15="http://schemas.microsoft.com/office/word/2012/wordml" xmlns:w16cex="http://schemas.microsoft.com/office/word/2018/wordml/cex" xmlns:w16cid="http://schemas.microsoft.com/office/word/2016/wordml/cid" xmlns:w16="http://schemas.microsoft.com/office/word/2018/wordml" xmlns:w16sdtdh="http://schemas.microsoft.com/office/word/2020/wordml/sdtdatahash" xmlns:w16se="http://schemas.microsoft.com/office/word/2015/wordml/symex" xmlns:wpg="http://schemas.microsoft.com/office/word/2010/wordprocessingGroup" xmlns:wpi="http://schemas.microsoft.com/office/word/2010/wordprocessingInk" xmlns:wne="http://schemas.microsoft.com/office/word/2006/wordml" xmlns:wps="http://schemas.microsoft.com/office/word/2010/wordprocessingShape" mc:Ignorable="w14 w15 w16se w16cid w16 w16cex w16sdtdh wp14">
   <w:body>
     <w:tbl>
       <w:tblPr>
@@ -301,7 +301,7 @@
           <w:szCs w:val="40"/>
           <w:lang w:val="es-ES_tradnl"/>
         </w:rPr>
-        <w:t xml:space="preserve">&lt;&lt;Formato </w:t>
+        <w:t xml:space="preserve">  </w:t>
       </w:r>
       <w:r>
         <w:rPr>
@@ -310,6 +310,15 @@
           <w:szCs w:val="40"/>
           <w:lang w:val="es-ES_tradnl"/>
         </w:rPr>
+        <w:t xml:space="preserve">Formato </w:t>
+      </w:r>
+      <w:r>
+        <w:rPr>
+          <w:rFonts w:ascii="Arial" w:hAnsi="Arial" w:cs="Arial"/>
+          <w:sz w:val="40"/>
+          <w:szCs w:val="40"/>
+          <w:lang w:val="es-ES_tradnl"/>
+        </w:rPr>
         <w:t>Entrega 1</w:t>
       </w:r>
       <w:r>
@@ -319,7 +328,7 @@
           <w:szCs w:val="40"/>
           <w:lang w:val="es-ES_tradnl"/>
         </w:rPr>
-        <w:t>&gt;&gt;</w:t>
+        <w:t xml:space="preserve">  </w:t>
       </w:r>
     </w:p>
     <w:p>
@@ -455,7 +464,30 @@
           <w:rFonts w:ascii="Arial" w:hAnsi="Arial" w:cs="Arial"/>
           <w:color w:val="1E2328"/>
         </w:rPr>
-        <w:t>&lt;&lt;Nombre Profesor o Profesora&gt;&gt;</w:t>
+        <w:t xml:space="preserve">  </w:t>
+      </w:r>
+      <w:proofErr w:type="spellStart"/>
+      <w:r>
+        <w:rPr>
+          <w:rFonts w:ascii="Arial" w:hAnsi="Arial" w:cs="Arial"/>
+          <w:color w:val="1E2328"/>
+        </w:rPr>
+        <w:t>Yosly</w:t>
+      </w:r>
+      <w:proofErr w:type="spellEnd"/>
+      <w:r>
+        <w:rPr>
+          <w:rFonts w:ascii="Arial" w:hAnsi="Arial" w:cs="Arial"/>
+          <w:color w:val="1E2328"/>
+        </w:rPr>
+        <w:t xml:space="preserve"> Hernández</w:t>
+      </w:r>
+      <w:r>
+        <w:rPr>
+          <w:rFonts w:ascii="Arial" w:hAnsi="Arial" w:cs="Arial"/>
+          <w:color w:val="1E2328"/>
+        </w:rPr>
+        <w:t xml:space="preserve">  </w:t>
       </w:r>
     </w:p>
     <w:p>
@@ -473,7 +505,28 @@
           <w:rFonts w:ascii="Arial" w:hAnsi="Arial" w:cs="Arial"/>
           <w:color w:val="1E2328"/>
         </w:rPr>
-        <w:t>Sección: &lt;&lt;Nombre Sección&gt;&gt;</w:t>
+        <w:t xml:space="preserve">Sección: </w:t>
+      </w:r>
+      <w:r>
+        <w:rPr>
+          <w:rFonts w:ascii="Arial" w:hAnsi="Arial" w:cs="Arial"/>
+          <w:color w:val="1E2328"/>
+        </w:rPr>
+        <w:t xml:space="preserve">  </w:t>
+      </w:r>
+      <w:r>
+        <w:rPr>
+          <w:rFonts w:ascii="Arial" w:hAnsi="Arial" w:cs="Arial"/>
+          <w:color w:val="1E2328"/>
+        </w:rPr>
+        <w:t>Nombre Sección</w:t>
+      </w:r>
+      <w:r>
+        <w:rPr>
+          <w:rFonts w:ascii="Arial" w:hAnsi="Arial" w:cs="Arial"/>
+          <w:color w:val="1E2328"/>
+        </w:rPr>
+        <w:t xml:space="preserve">  </w:t>
       </w:r>
       <w:r>
         <w:rPr>
@@ -515,30 +568,7 @@
           <w:rFonts w:ascii="Arial" w:hAnsi="Arial" w:cs="Arial"/>
           <w:color w:val="1E2328"/>
         </w:rPr>
-        <w:t xml:space="preserve"> &lt;&lt;</w:t>
-      </w:r>
-      <w:proofErr w:type="spellStart"/>
-      <w:r>
-        <w:rPr>
-          <w:rFonts w:ascii="Arial" w:hAnsi="Arial" w:cs="Arial"/>
-          <w:color w:val="1E2328"/>
-        </w:rPr>
-        <w:t>Nro</w:t>
-      </w:r>
-      <w:proofErr w:type="spellEnd"/>
-      <w:r>
-        <w:rPr>
-          <w:rFonts w:ascii="Arial" w:hAnsi="Arial" w:cs="Arial"/>
-          <w:color w:val="1E2328"/>
-        </w:rPr>
-        <w:t xml:space="preserve"> Equipo&gt;&gt;</w:t>
-      </w:r>
-      <w:r>
-        <w:rPr>
-          <w:rFonts w:ascii="Arial" w:hAnsi="Arial" w:cs="Arial"/>
-          <w:color w:val="1E2328"/>
-        </w:rPr>
-        <w:t>:</w:t>
+        <w:t>13</w:t>
       </w:r>
     </w:p>
     <w:p>
@@ -555,19 +585,27 @@
         <w:rPr>
           <w:rFonts w:ascii="Arial" w:hAnsi="Arial" w:cs="Arial"/>
         </w:rPr>
-        <w:t>&lt;&lt;</w:t>
-      </w:r>
-      <w:r>
-        <w:rPr>
-          <w:rFonts w:ascii="Arial" w:hAnsi="Arial" w:cs="Arial"/>
-        </w:rPr>
-        <w:t>Nombre y apellido integrante 1</w:t>
-      </w:r>
-      <w:r>
-        <w:rPr>
-          <w:rFonts w:ascii="Arial" w:hAnsi="Arial" w:cs="Arial"/>
-        </w:rPr>
-        <w:t>&gt;&gt;</w:t>
+        <w:t xml:space="preserve">  </w:t>
+      </w:r>
+      <w:r>
+        <w:rPr>
+          <w:rFonts w:ascii="Arial" w:hAnsi="Arial" w:cs="Arial"/>
+        </w:rPr>
+        <w:t xml:space="preserve">Ramses </w:t>
+      </w:r>
+      <w:proofErr w:type="spellStart"/>
+      <w:r>
+        <w:rPr>
+          <w:rFonts w:ascii="Arial" w:hAnsi="Arial" w:cs="Arial"/>
+        </w:rPr>
+        <w:t>Cordoba</w:t>
+      </w:r>
+      <w:proofErr w:type="spellEnd"/>
+      <w:r>
+        <w:rPr>
+          <w:rFonts w:ascii="Arial" w:hAnsi="Arial" w:cs="Arial"/>
+        </w:rPr>
+        <w:t xml:space="preserve">  </w:t>
       </w:r>
       <w:r>
         <w:rPr>
@@ -590,19 +628,25 @@
         <w:rPr>
           <w:rFonts w:ascii="Arial" w:hAnsi="Arial" w:cs="Arial"/>
         </w:rPr>
-        <w:t>&lt;&lt;</w:t>
-      </w:r>
-      <w:r>
-        <w:rPr>
-          <w:rFonts w:ascii="Arial" w:hAnsi="Arial" w:cs="Arial"/>
-        </w:rPr>
-        <w:t>Nombre y apellido integrante 2</w:t>
-      </w:r>
-      <w:r>
-        <w:rPr>
-          <w:rFonts w:ascii="Arial" w:hAnsi="Arial" w:cs="Arial"/>
-        </w:rPr>
-        <w:t>&gt;&gt;</w:t>
+        <w:t xml:space="preserve">  </w:t>
+      </w:r>
+      <w:r>
+        <w:rPr>
+          <w:rFonts w:ascii="Arial" w:hAnsi="Arial" w:cs="Arial"/>
+        </w:rPr>
+        <w:t>Gabriel Castillo</w:t>
+      </w:r>
+      <w:r>
+        <w:rPr>
+          <w:rFonts w:ascii="Arial" w:hAnsi="Arial" w:cs="Arial"/>
+        </w:rPr>
+        <w:t xml:space="preserve"> </w:t>
+      </w:r>
+      <w:r>
+        <w:rPr>
+          <w:rFonts w:ascii="Arial" w:hAnsi="Arial" w:cs="Arial"/>
+        </w:rPr>
+        <w:t xml:space="preserve">  </w:t>
       </w:r>
     </w:p>
     <w:p>
@@ -619,19 +663,25 @@
         <w:rPr>
           <w:rFonts w:ascii="Arial" w:hAnsi="Arial" w:cs="Arial"/>
         </w:rPr>
-        <w:t>&lt;&lt;</w:t>
-      </w:r>
-      <w:r>
-        <w:rPr>
-          <w:rFonts w:ascii="Arial" w:hAnsi="Arial" w:cs="Arial"/>
-        </w:rPr>
-        <w:t xml:space="preserve">Nombre y apellido integrante 3 </w:t>
-      </w:r>
-      <w:r>
-        <w:rPr>
-          <w:rFonts w:ascii="Arial" w:hAnsi="Arial" w:cs="Arial"/>
-        </w:rPr>
-        <w:t>&gt;&gt;</w:t>
+        <w:t xml:space="preserve">  </w:t>
+      </w:r>
+      <w:r>
+        <w:rPr>
+          <w:rFonts w:ascii="Arial" w:hAnsi="Arial" w:cs="Arial"/>
+        </w:rPr>
+        <w:t>Genesis Noriega</w:t>
+      </w:r>
+      <w:r>
+        <w:rPr>
+          <w:rFonts w:ascii="Arial" w:hAnsi="Arial" w:cs="Arial"/>
+        </w:rPr>
+        <w:t xml:space="preserve"> </w:t>
+      </w:r>
+      <w:r>
+        <w:rPr>
+          <w:rFonts w:ascii="Arial" w:hAnsi="Arial" w:cs="Arial"/>
+        </w:rPr>
+        <w:t xml:space="preserve">  </w:t>
       </w:r>
     </w:p>
     <w:p>
@@ -648,19 +698,25 @@
         <w:rPr>
           <w:rFonts w:ascii="Arial" w:hAnsi="Arial" w:cs="Arial"/>
         </w:rPr>
-        <w:t>&lt;&lt;</w:t>
-      </w:r>
-      <w:r>
-        <w:rPr>
-          <w:rFonts w:ascii="Arial" w:hAnsi="Arial" w:cs="Arial"/>
-        </w:rPr>
-        <w:t>Nombre y apellido integrante 4</w:t>
-      </w:r>
-      <w:r>
-        <w:rPr>
-          <w:rFonts w:ascii="Arial" w:hAnsi="Arial" w:cs="Arial"/>
-        </w:rPr>
-        <w:t>&gt;&gt;</w:t>
+        <w:t xml:space="preserve">  </w:t>
+      </w:r>
+      <w:r>
+        <w:rPr>
+          <w:rFonts w:ascii="Arial" w:hAnsi="Arial" w:cs="Arial"/>
+        </w:rPr>
+        <w:t>Alejandro Rondón</w:t>
+      </w:r>
+      <w:r>
+        <w:rPr>
+          <w:rFonts w:ascii="Arial" w:hAnsi="Arial" w:cs="Arial"/>
+        </w:rPr>
+        <w:t xml:space="preserve"> </w:t>
+      </w:r>
+      <w:r>
+        <w:rPr>
+          <w:rFonts w:ascii="Arial" w:hAnsi="Arial" w:cs="Arial"/>
+        </w:rPr>
+        <w:t xml:space="preserve">  </w:t>
       </w:r>
     </w:p>
     <w:p>
@@ -677,7 +733,25 @@
         <w:rPr>
           <w:rFonts w:ascii="Arial" w:hAnsi="Arial" w:cs="Arial"/>
         </w:rPr>
-        <w:t>&lt;&lt;Fecha Entrega&gt;&gt;</w:t>
+        <w:t xml:space="preserve">  </w:t>
+      </w:r>
+      <w:r>
+        <w:rPr>
+          <w:rFonts w:ascii="Arial" w:hAnsi="Arial" w:cs="Arial"/>
+        </w:rPr>
+        <w:t>12/12/25</w:t>
+      </w:r>
+      <w:r>
+        <w:rPr>
+          <w:rFonts w:ascii="Arial" w:hAnsi="Arial" w:cs="Arial"/>
+        </w:rPr>
+        <w:t xml:space="preserve"> </w:t>
+      </w:r>
+      <w:r>
+        <w:rPr>
+          <w:rFonts w:ascii="Arial" w:hAnsi="Arial" w:cs="Arial"/>
+        </w:rPr>
+        <w:t xml:space="preserve">  </w:t>
       </w:r>
     </w:p>
     <w:p>
@@ -723,7 +797,7 @@
     </w:p>
     <w:p>
       <w:r>
-        <w:t>&lt;&lt;</w:t>
+        <w:t xml:space="preserve">  </w:t>
       </w:r>
       <w:r>
         <w:t>L</w:t>
@@ -753,7 +827,10 @@
         <w:t xml:space="preserve"> de estos</w:t>
       </w:r>
       <w:r>
-        <w:t xml:space="preserve"> &gt;&gt;</w:t>
+        <w:t xml:space="preserve"> </w:t>
+      </w:r>
+      <w:r>
+        <w:t xml:space="preserve">  </w:t>
       </w:r>
     </w:p>
     <w:p>
@@ -820,7 +897,10 @@
     </w:p>
     <w:p>
       <w:r>
-        <w:t xml:space="preserve">&lt;&lt;Insertar </w:t>
+        <w:t xml:space="preserve">  </w:t>
+      </w:r>
+      <w:r>
+        <w:t xml:space="preserve">Insertar </w:t>
       </w:r>
       <w:proofErr w:type="spellStart"/>
       <w:r>
@@ -828,7 +908,10 @@
       </w:r>
       <w:proofErr w:type="spellEnd"/>
       <w:r>
-        <w:t xml:space="preserve"> del diagrama de clases que modela al dominio &gt;&gt;</w:t>
+        <w:t xml:space="preserve"> del diagrama de clases que modela al dominio </w:t>
+      </w:r>
+      <w:r>
+        <w:t xml:space="preserve">  </w:t>
       </w:r>
     </w:p>
     <w:p>
@@ -887,7 +970,10 @@
     </w:p>
     <w:p>
       <w:r>
-        <w:t xml:space="preserve">&lt;&lt;Insertar </w:t>
+        <w:t xml:space="preserve">  </w:t>
+      </w:r>
+      <w:r>
+        <w:t xml:space="preserve">Insertar </w:t>
       </w:r>
       <w:proofErr w:type="spellStart"/>
       <w:r>
@@ -895,7 +981,10 @@
       </w:r>
       <w:proofErr w:type="spellEnd"/>
       <w:r>
-        <w:t xml:space="preserve"> del diagrama de contexto o estado que complementa al modelo al dominio (deben ser legibles) &gt;&gt;</w:t>
+        <w:t xml:space="preserve"> del diagrama de contexto o estado que complementa al modelo al dominio (deben ser legibles) </w:t>
+      </w:r>
+      <w:r>
+        <w:t xml:space="preserve">  </w:t>
       </w:r>
     </w:p>
     <w:p>
@@ -914,7 +1003,13 @@
     </w:p>
     <w:p>
       <w:r>
-        <w:t>&lt;&lt;Insertar Ficha de Visión (ver Figura 1) del Producto debidamente llenada &gt;&gt;</w:t>
+        <w:t xml:space="preserve">  </w:t>
+      </w:r>
+      <w:r>
+        <w:t xml:space="preserve">Insertar Ficha de Visión (ver Figura 1) del Producto debidamente llenada </w:t>
+      </w:r>
+      <w:r>
+        <w:t xml:space="preserve">  </w:t>
       </w:r>
     </w:p>
     <w:p>
@@ -1068,7 +1163,10 @@
     </w:p>
     <w:p>
       <w:r>
-        <w:t xml:space="preserve">&lt;&lt;Insertar </w:t>
+        <w:t xml:space="preserve">  </w:t>
+      </w:r>
+      <w:r>
+        <w:t xml:space="preserve">Insertar </w:t>
       </w:r>
       <w:proofErr w:type="spellStart"/>
       <w:r>
@@ -1076,7 +1174,10 @@
       </w:r>
       <w:proofErr w:type="spellEnd"/>
       <w:r>
-        <w:t xml:space="preserve"> del diagrama de casos de uso &gt;&gt;</w:t>
+        <w:t xml:space="preserve"> del diagrama de casos de uso </w:t>
+      </w:r>
+      <w:r>
+        <w:t xml:space="preserve">  </w:t>
       </w:r>
     </w:p>
     <w:p>
@@ -1145,7 +1246,7 @@
     </w:p>
     <w:p>
       <w:r>
-        <w:t>&lt;&lt;</w:t>
+        <w:t xml:space="preserve">  </w:t>
       </w:r>
       <w:r>
         <w:t xml:space="preserve">Listar los </w:t>
@@ -1154,10 +1255,21 @@
         <w:t xml:space="preserve">casos de uso prioritarios </w:t>
       </w:r>
       <w:r>
-        <w:t xml:space="preserve">más una </w:t>
-      </w:r>
-      <w:r>
-        <w:t xml:space="preserve"> breve justificación de su priorización &gt;&gt;</w:t>
+        <w:t xml:space="preserve">más </w:t>
+      </w:r>
+      <w:proofErr w:type="gramStart"/>
+      <w:r>
+        <w:t xml:space="preserve">una </w:t>
+      </w:r>
+      <w:r>
+        <w:t xml:space="preserve"> breve</w:t>
+      </w:r>
+      <w:proofErr w:type="gramEnd"/>
+      <w:r>
+        <w:t xml:space="preserve"> justificación de su priorización </w:t>
+      </w:r>
+      <w:r>
+        <w:t xml:space="preserve">  </w:t>
       </w:r>
     </w:p>
     <w:p/>
@@ -1207,7 +1319,13 @@
     </w:p>
     <w:p>
       <w:r>
-        <w:t>&lt;&lt;Realizar la especificación de cada caso de uso prioritario con base en el formato visto en clase (ver Figura 2) &gt;&gt;</w:t>
+        <w:t xml:space="preserve">  </w:t>
+      </w:r>
+      <w:r>
+        <w:t xml:space="preserve">Realizar la especificación de cada caso de uso prioritario con base en el formato visto en clase (ver Figura 2) </w:t>
+      </w:r>
+      <w:r>
+        <w:t xml:space="preserve">  </w:t>
       </w:r>
     </w:p>
     <w:p/>
@@ -1341,7 +1459,10 @@
     </w:p>
     <w:p>
       <w:r>
-        <w:t xml:space="preserve">&lt;&lt;Insertar Imágenes del prototipo de interfaz. Si lo realiza con </w:t>
+        <w:t xml:space="preserve">  </w:t>
+      </w:r>
+      <w:r>
+        <w:t xml:space="preserve">Insertar Imágenes del prototipo de interfaz. Si lo realiza con </w:t>
       </w:r>
       <w:proofErr w:type="spellStart"/>
       <w:r>
@@ -1353,7 +1474,10 @@
       </w:r>
       <w:proofErr w:type="spellEnd"/>
       <w:r>
-        <w:t xml:space="preserve"> incluir el enlace&gt;&gt;</w:t>
+        <w:t xml:space="preserve"> incluir el enlace</w:t>
+      </w:r>
+      <w:r>
+        <w:t xml:space="preserve">  </w:t>
       </w:r>
     </w:p>
     <w:p/>
@@ -1372,7 +1496,7 @@
 </file>
 
 <file path=word/endnotes.xml><?xml version="1.0" encoding="utf-8"?>
-<w:endnotes xmlns:wpc="http://schemas.microsoft.com/office/word/2010/wordprocessingCanvas" xmlns:cx="http://schemas.microsoft.com/office/drawing/2014/chartex" xmlns:cx1="http://schemas.microsoft.com/office/drawing/2015/9/8/chartex" xmlns:cx2="http://schemas.microsoft.com/office/drawing/2015/10/21/chartex" xmlns:cx3="http://schemas.microsoft.com/office/drawing/2016/5/9/chartex" xmlns:cx4="http://schemas.microsoft.com/office/drawing/2016/5/10/chartex" xmlns:cx5="http://schemas.microsoft.com/office/drawing/2016/5/11/chartex" xmlns:cx6="http://schemas.microsoft.com/office/drawing/2016/5/12/chartex" xmlns:cx7="http://schemas.microsoft.com/office/drawing/2016/5/13/chartex" xmlns:cx8="http://schemas.microsoft.com/office/drawing/2016/5/14/chartex" xmlns:mc="http://schemas.openxmlformats.org/markup-compatibility/2006" xmlns:aink="http://schemas.microsoft.com/office/drawing/2016/ink" xmlns:am3d="http://schemas.microsoft.com/office/drawing/2017/model3d" xmlns:o="urn:schemas-microsoft-com:office:office" xmlns:oel="http://schemas.microsoft.com/office/2019/extlst" xmlns:r="http://schemas.openxmlformats.org/officeDocument/2006/relationships" xmlns:m="http://schemas.openxmlformats.org/officeDocument/2006/math" xmlns:v="urn:schemas-microsoft-com:vml" xmlns:wp14="http://schemas.microsoft.com/office/word/2010/wordprocessingDrawing" xmlns:wp="http://schemas.openxmlformats.org/drawingml/2006/wordprocessingDrawing" xmlns:w10="urn:schemas-microsoft-com:office:word" xmlns:w="http://schemas.openxmlformats.org/wordprocessingml/2006/main" xmlns:w14="http://schemas.microsoft.com/office/word/2010/wordml" xmlns:w15="http://schemas.microsoft.com/office/word/2012/wordml" xmlns:w16cex="http://schemas.microsoft.com/office/word/2018/wordml/cex" xmlns:w16cid="http://schemas.microsoft.com/office/word/2016/wordml/cid" xmlns:w16="http://schemas.microsoft.com/office/word/2018/wordml" xmlns:w16du="http://schemas.microsoft.com/office/word/2023/wordml/word16du" xmlns:w16sdtdh="http://schemas.microsoft.com/office/word/2020/wordml/sdtdatahash" xmlns:w16sdtfl="http://schemas.microsoft.com/office/word/2024/wordml/sdtformatlock" xmlns:w16se="http://schemas.microsoft.com/office/word/2015/wordml/symex" xmlns:wpg="http://schemas.microsoft.com/office/word/2010/wordprocessingGroup" xmlns:wpi="http://schemas.microsoft.com/office/word/2010/wordprocessingInk" xmlns:wne="http://schemas.microsoft.com/office/word/2006/wordml" xmlns:wps="http://schemas.microsoft.com/office/word/2010/wordprocessingShape" mc:Ignorable="w14 w15 w16se w16cid w16 w16cex w16sdtdh w16sdtfl w16du wp14">
+<w:endnotes xmlns:wpc="http://schemas.microsoft.com/office/word/2010/wordprocessingCanvas" xmlns:cx="http://schemas.microsoft.com/office/drawing/2014/chartex" xmlns:cx1="http://schemas.microsoft.com/office/drawing/2015/9/8/chartex" xmlns:cx2="http://schemas.microsoft.com/office/drawing/2015/10/21/chartex" xmlns:cx3="http://schemas.microsoft.com/office/drawing/2016/5/9/chartex" xmlns:cx4="http://schemas.microsoft.com/office/drawing/2016/5/10/chartex" xmlns:cx5="http://schemas.microsoft.com/office/drawing/2016/5/11/chartex" xmlns:cx6="http://schemas.microsoft.com/office/drawing/2016/5/12/chartex" xmlns:cx7="http://schemas.microsoft.com/office/drawing/2016/5/13/chartex" xmlns:cx8="http://schemas.microsoft.com/office/drawing/2016/5/14/chartex" xmlns:mc="http://schemas.openxmlformats.org/markup-compatibility/2006" xmlns:aink="http://schemas.microsoft.com/office/drawing/2016/ink" xmlns:am3d="http://schemas.microsoft.com/office/drawing/2017/model3d" xmlns:o="urn:schemas-microsoft-com:office:office" xmlns:r="http://schemas.openxmlformats.org/officeDocument/2006/relationships" xmlns:m="http://schemas.openxmlformats.org/officeDocument/2006/math" xmlns:v="urn:schemas-microsoft-com:vml" xmlns:wp14="http://schemas.microsoft.com/office/word/2010/wordprocessingDrawing" xmlns:wp="http://schemas.openxmlformats.org/drawingml/2006/wordprocessingDrawing" xmlns:w10="urn:schemas-microsoft-com:office:word" xmlns:w="http://schemas.openxmlformats.org/wordprocessingml/2006/main" xmlns:w14="http://schemas.microsoft.com/office/word/2010/wordml" xmlns:w15="http://schemas.microsoft.com/office/word/2012/wordml" xmlns:w16cex="http://schemas.microsoft.com/office/word/2018/wordml/cex" xmlns:w16cid="http://schemas.microsoft.com/office/word/2016/wordml/cid" xmlns:w16="http://schemas.microsoft.com/office/word/2018/wordml" xmlns:w16sdtdh="http://schemas.microsoft.com/office/word/2020/wordml/sdtdatahash" xmlns:w16se="http://schemas.microsoft.com/office/word/2015/wordml/symex" xmlns:wpg="http://schemas.microsoft.com/office/word/2010/wordprocessingGroup" xmlns:wpi="http://schemas.microsoft.com/office/word/2010/wordprocessingInk" xmlns:wne="http://schemas.microsoft.com/office/word/2006/wordml" xmlns:wps="http://schemas.microsoft.com/office/word/2010/wordprocessingShape" mc:Ignorable="w14 w15 w16se w16cid w16 w16cex w16sdtdh wp14">
   <w:endnote w:type="separator" w:id="-1">
     <w:p>
       <w:r>
@@ -1391,11 +1515,11 @@
 </file>
 
 <file path=word/footer1.xml><?xml version="1.0" encoding="utf-8"?>
-<w:ftr xmlns:wpc="http://schemas.microsoft.com/office/word/2010/wordprocessingCanvas" xmlns:cx="http://schemas.microsoft.com/office/drawing/2014/chartex" xmlns:cx1="http://schemas.microsoft.com/office/drawing/2015/9/8/chartex" xmlns:cx2="http://schemas.microsoft.com/office/drawing/2015/10/21/chartex" xmlns:cx3="http://schemas.microsoft.com/office/drawing/2016/5/9/chartex" xmlns:cx4="http://schemas.microsoft.com/office/drawing/2016/5/10/chartex" xmlns:cx5="http://schemas.microsoft.com/office/drawing/2016/5/11/chartex" xmlns:cx6="http://schemas.microsoft.com/office/drawing/2016/5/12/chartex" xmlns:cx7="http://schemas.microsoft.com/office/drawing/2016/5/13/chartex" xmlns:cx8="http://schemas.microsoft.com/office/drawing/2016/5/14/chartex" xmlns:mc="http://schemas.openxmlformats.org/markup-compatibility/2006" xmlns:aink="http://schemas.microsoft.com/office/drawing/2016/ink" xmlns:am3d="http://schemas.microsoft.com/office/drawing/2017/model3d" xmlns:o="urn:schemas-microsoft-com:office:office" xmlns:oel="http://schemas.microsoft.com/office/2019/extlst" xmlns:r="http://schemas.openxmlformats.org/officeDocument/2006/relationships" xmlns:m="http://schemas.openxmlformats.org/officeDocument/2006/math" xmlns:v="urn:schemas-microsoft-com:vml" xmlns:wp14="http://schemas.microsoft.com/office/word/2010/wordprocessingDrawing" xmlns:wp="http://schemas.openxmlformats.org/drawingml/2006/wordprocessingDrawing" xmlns:w10="urn:schemas-microsoft-com:office:word" xmlns:w="http://schemas.openxmlformats.org/wordprocessingml/2006/main" xmlns:w14="http://schemas.microsoft.com/office/word/2010/wordml" xmlns:w15="http://schemas.microsoft.com/office/word/2012/wordml" xmlns:w16cex="http://schemas.microsoft.com/office/word/2018/wordml/cex" xmlns:w16cid="http://schemas.microsoft.com/office/word/2016/wordml/cid" xmlns:w16="http://schemas.microsoft.com/office/word/2018/wordml" xmlns:w16du="http://schemas.microsoft.com/office/word/2023/wordml/word16du" xmlns:w16sdtdh="http://schemas.microsoft.com/office/word/2020/wordml/sdtdatahash" xmlns:w16sdtfl="http://schemas.microsoft.com/office/word/2024/wordml/sdtformatlock" xmlns:w16se="http://schemas.microsoft.com/office/word/2015/wordml/symex" xmlns:wpg="http://schemas.microsoft.com/office/word/2010/wordprocessingGroup" xmlns:wpi="http://schemas.microsoft.com/office/word/2010/wordprocessingInk" xmlns:wne="http://schemas.microsoft.com/office/word/2006/wordml" xmlns:wps="http://schemas.microsoft.com/office/word/2010/wordprocessingShape" mc:Ignorable="w14 w15 w16se w16cid w16 w16cex w16sdtdh w16sdtfl w16du wp14">
+<w:ftr xmlns:wpc="http://schemas.microsoft.com/office/word/2010/wordprocessingCanvas" xmlns:cx="http://schemas.microsoft.com/office/drawing/2014/chartex" xmlns:cx1="http://schemas.microsoft.com/office/drawing/2015/9/8/chartex" xmlns:cx2="http://schemas.microsoft.com/office/drawing/2015/10/21/chartex" xmlns:cx3="http://schemas.microsoft.com/office/drawing/2016/5/9/chartex" xmlns:cx4="http://schemas.microsoft.com/office/drawing/2016/5/10/chartex" xmlns:cx5="http://schemas.microsoft.com/office/drawing/2016/5/11/chartex" xmlns:cx6="http://schemas.microsoft.com/office/drawing/2016/5/12/chartex" xmlns:cx7="http://schemas.microsoft.com/office/drawing/2016/5/13/chartex" xmlns:cx8="http://schemas.microsoft.com/office/drawing/2016/5/14/chartex" xmlns:mc="http://schemas.openxmlformats.org/markup-compatibility/2006" xmlns:aink="http://schemas.microsoft.com/office/drawing/2016/ink" xmlns:am3d="http://schemas.microsoft.com/office/drawing/2017/model3d" xmlns:o="urn:schemas-microsoft-com:office:office" xmlns:r="http://schemas.openxmlformats.org/officeDocument/2006/relationships" xmlns:m="http://schemas.openxmlformats.org/officeDocument/2006/math" xmlns:v="urn:schemas-microsoft-com:vml" xmlns:wp14="http://schemas.microsoft.com/office/word/2010/wordprocessingDrawing" xmlns:wp="http://schemas.openxmlformats.org/drawingml/2006/wordprocessingDrawing" xmlns:w10="urn:schemas-microsoft-com:office:word" xmlns:w="http://schemas.openxmlformats.org/wordprocessingml/2006/main" xmlns:w14="http://schemas.microsoft.com/office/word/2010/wordml" xmlns:w15="http://schemas.microsoft.com/office/word/2012/wordml" xmlns:w16cex="http://schemas.microsoft.com/office/word/2018/wordml/cex" xmlns:w16cid="http://schemas.microsoft.com/office/word/2016/wordml/cid" xmlns:w16="http://schemas.microsoft.com/office/word/2018/wordml" xmlns:w16sdtdh="http://schemas.microsoft.com/office/word/2020/wordml/sdtdatahash" xmlns:w16se="http://schemas.microsoft.com/office/word/2015/wordml/symex" xmlns:wpg="http://schemas.microsoft.com/office/word/2010/wordprocessingGroup" xmlns:wpi="http://schemas.microsoft.com/office/word/2010/wordprocessingInk" xmlns:wne="http://schemas.microsoft.com/office/word/2006/wordml" xmlns:wps="http://schemas.microsoft.com/office/word/2010/wordprocessingShape" mc:Ignorable="w14 w15 w16se w16cid w16 w16cex w16sdtdh wp14">
   <w:sdt>
     <w:sdtPr>
       <w:rPr>
-        <w:rStyle w:val="PageNumber"/>
+        <w:rStyle w:val="Nmerodepgina"/>
       </w:rPr>
       <w:id w:val="663741279"/>
       <w:docPartObj>
@@ -1403,30 +1527,35 @@
         <w:docPartUnique/>
       </w:docPartObj>
     </w:sdtPr>
+    <w:sdtEndPr>
+      <w:rPr>
+        <w:rStyle w:val="Nmerodepgina"/>
+      </w:rPr>
+    </w:sdtEndPr>
     <w:sdtContent>
       <w:p>
         <w:pPr>
-          <w:pStyle w:val="Footer"/>
+          <w:pStyle w:val="Piedepgina"/>
           <w:framePr w:wrap="none" w:vAnchor="text" w:hAnchor="margin" w:xAlign="right" w:y="1"/>
           <w:rPr>
-            <w:rStyle w:val="PageNumber"/>
+            <w:rStyle w:val="Nmerodepgina"/>
           </w:rPr>
         </w:pPr>
         <w:r>
           <w:rPr>
-            <w:rStyle w:val="PageNumber"/>
+            <w:rStyle w:val="Nmerodepgina"/>
           </w:rPr>
           <w:fldChar w:fldCharType="begin"/>
         </w:r>
         <w:r>
           <w:rPr>
-            <w:rStyle w:val="PageNumber"/>
+            <w:rStyle w:val="Nmerodepgina"/>
           </w:rPr>
           <w:instrText xml:space="preserve"> PAGE </w:instrText>
         </w:r>
         <w:r>
           <w:rPr>
-            <w:rStyle w:val="PageNumber"/>
+            <w:rStyle w:val="Nmerodepgina"/>
           </w:rPr>
           <w:fldChar w:fldCharType="end"/>
         </w:r>
@@ -1435,7 +1564,7 @@
   </w:sdt>
   <w:p>
     <w:pPr>
-      <w:pStyle w:val="Footer"/>
+      <w:pStyle w:val="Piedepgina"/>
       <w:ind w:right="360"/>
     </w:pPr>
   </w:p>
@@ -1443,11 +1572,11 @@
 </file>
 
 <file path=word/footer2.xml><?xml version="1.0" encoding="utf-8"?>
-<w:ftr xmlns:wpc="http://schemas.microsoft.com/office/word/2010/wordprocessingCanvas" xmlns:cx="http://schemas.microsoft.com/office/drawing/2014/chartex" xmlns:cx1="http://schemas.microsoft.com/office/drawing/2015/9/8/chartex" xmlns:cx2="http://schemas.microsoft.com/office/drawing/2015/10/21/chartex" xmlns:cx3="http://schemas.microsoft.com/office/drawing/2016/5/9/chartex" xmlns:cx4="http://schemas.microsoft.com/office/drawing/2016/5/10/chartex" xmlns:cx5="http://schemas.microsoft.com/office/drawing/2016/5/11/chartex" xmlns:cx6="http://schemas.microsoft.com/office/drawing/2016/5/12/chartex" xmlns:cx7="http://schemas.microsoft.com/office/drawing/2016/5/13/chartex" xmlns:cx8="http://schemas.microsoft.com/office/drawing/2016/5/14/chartex" xmlns:mc="http://schemas.openxmlformats.org/markup-compatibility/2006" xmlns:aink="http://schemas.microsoft.com/office/drawing/2016/ink" xmlns:am3d="http://schemas.microsoft.com/office/drawing/2017/model3d" xmlns:o="urn:schemas-microsoft-com:office:office" xmlns:oel="http://schemas.microsoft.com/office/2019/extlst" xmlns:r="http://schemas.openxmlformats.org/officeDocument/2006/relationships" xmlns:m="http://schemas.openxmlformats.org/officeDocument/2006/math" xmlns:v="urn:schemas-microsoft-com:vml" xmlns:wp14="http://schemas.microsoft.com/office/word/2010/wordprocessingDrawing" xmlns:wp="http://schemas.openxmlformats.org/drawingml/2006/wordprocessingDrawing" xmlns:w10="urn:schemas-microsoft-com:office:word" xmlns:w="http://schemas.openxmlformats.org/wordprocessingml/2006/main" xmlns:w14="http://schemas.microsoft.com/office/word/2010/wordml" xmlns:w15="http://schemas.microsoft.com/office/word/2012/wordml" xmlns:w16cex="http://schemas.microsoft.com/office/word/2018/wordml/cex" xmlns:w16cid="http://schemas.microsoft.com/office/word/2016/wordml/cid" xmlns:w16="http://schemas.microsoft.com/office/word/2018/wordml" xmlns:w16du="http://schemas.microsoft.com/office/word/2023/wordml/word16du" xmlns:w16sdtdh="http://schemas.microsoft.com/office/word/2020/wordml/sdtdatahash" xmlns:w16sdtfl="http://schemas.microsoft.com/office/word/2024/wordml/sdtformatlock" xmlns:w16se="http://schemas.microsoft.com/office/word/2015/wordml/symex" xmlns:wpg="http://schemas.microsoft.com/office/word/2010/wordprocessingGroup" xmlns:wpi="http://schemas.microsoft.com/office/word/2010/wordprocessingInk" xmlns:wne="http://schemas.microsoft.com/office/word/2006/wordml" xmlns:wps="http://schemas.microsoft.com/office/word/2010/wordprocessingShape" mc:Ignorable="w14 w15 w16se w16cid w16 w16cex w16sdtdh w16sdtfl w16du wp14">
+<w:ftr xmlns:wpc="http://schemas.microsoft.com/office/word/2010/wordprocessingCanvas" xmlns:cx="http://schemas.microsoft.com/office/drawing/2014/chartex" xmlns:cx1="http://schemas.microsoft.com/office/drawing/2015/9/8/chartex" xmlns:cx2="http://schemas.microsoft.com/office/drawing/2015/10/21/chartex" xmlns:cx3="http://schemas.microsoft.com/office/drawing/2016/5/9/chartex" xmlns:cx4="http://schemas.microsoft.com/office/drawing/2016/5/10/chartex" xmlns:cx5="http://schemas.microsoft.com/office/drawing/2016/5/11/chartex" xmlns:cx6="http://schemas.microsoft.com/office/drawing/2016/5/12/chartex" xmlns:cx7="http://schemas.microsoft.com/office/drawing/2016/5/13/chartex" xmlns:cx8="http://schemas.microsoft.com/office/drawing/2016/5/14/chartex" xmlns:mc="http://schemas.openxmlformats.org/markup-compatibility/2006" xmlns:aink="http://schemas.microsoft.com/office/drawing/2016/ink" xmlns:am3d="http://schemas.microsoft.com/office/drawing/2017/model3d" xmlns:o="urn:schemas-microsoft-com:office:office" xmlns:r="http://schemas.openxmlformats.org/officeDocument/2006/relationships" xmlns:m="http://schemas.openxmlformats.org/officeDocument/2006/math" xmlns:v="urn:schemas-microsoft-com:vml" xmlns:wp14="http://schemas.microsoft.com/office/word/2010/wordprocessingDrawing" xmlns:wp="http://schemas.openxmlformats.org/drawingml/2006/wordprocessingDrawing" xmlns:w10="urn:schemas-microsoft-com:office:word" xmlns:w="http://schemas.openxmlformats.org/wordprocessingml/2006/main" xmlns:w14="http://schemas.microsoft.com/office/word/2010/wordml" xmlns:w15="http://schemas.microsoft.com/office/word/2012/wordml" xmlns:w16cex="http://schemas.microsoft.com/office/word/2018/wordml/cex" xmlns:w16cid="http://schemas.microsoft.com/office/word/2016/wordml/cid" xmlns:w16="http://schemas.microsoft.com/office/word/2018/wordml" xmlns:w16sdtdh="http://schemas.microsoft.com/office/word/2020/wordml/sdtdatahash" xmlns:w16se="http://schemas.microsoft.com/office/word/2015/wordml/symex" xmlns:wpg="http://schemas.microsoft.com/office/word/2010/wordprocessingGroup" xmlns:wpi="http://schemas.microsoft.com/office/word/2010/wordprocessingInk" xmlns:wne="http://schemas.microsoft.com/office/word/2006/wordml" xmlns:wps="http://schemas.microsoft.com/office/word/2010/wordprocessingShape" mc:Ignorable="w14 w15 w16se w16cid w16 w16cex w16sdtdh wp14">
   <w:sdt>
     <w:sdtPr>
       <w:rPr>
-        <w:rStyle w:val="PageNumber"/>
+        <w:rStyle w:val="Nmerodepgina"/>
       </w:rPr>
       <w:id w:val="1361856858"/>
       <w:docPartObj>
@@ -1455,43 +1584,48 @@
         <w:docPartUnique/>
       </w:docPartObj>
     </w:sdtPr>
+    <w:sdtEndPr>
+      <w:rPr>
+        <w:rStyle w:val="Nmerodepgina"/>
+      </w:rPr>
+    </w:sdtEndPr>
     <w:sdtContent>
       <w:p>
         <w:pPr>
-          <w:pStyle w:val="Footer"/>
+          <w:pStyle w:val="Piedepgina"/>
           <w:framePr w:wrap="none" w:vAnchor="text" w:hAnchor="margin" w:xAlign="right" w:y="1"/>
           <w:rPr>
-            <w:rStyle w:val="PageNumber"/>
+            <w:rStyle w:val="Nmerodepgina"/>
           </w:rPr>
         </w:pPr>
         <w:r>
           <w:rPr>
-            <w:rStyle w:val="PageNumber"/>
+            <w:rStyle w:val="Nmerodepgina"/>
           </w:rPr>
           <w:fldChar w:fldCharType="begin"/>
         </w:r>
         <w:r>
           <w:rPr>
-            <w:rStyle w:val="PageNumber"/>
+            <w:rStyle w:val="Nmerodepgina"/>
           </w:rPr>
           <w:instrText xml:space="preserve"> PAGE </w:instrText>
         </w:r>
         <w:r>
           <w:rPr>
-            <w:rStyle w:val="PageNumber"/>
+            <w:rStyle w:val="Nmerodepgina"/>
           </w:rPr>
           <w:fldChar w:fldCharType="separate"/>
         </w:r>
         <w:r>
           <w:rPr>
-            <w:rStyle w:val="PageNumber"/>
+            <w:rStyle w:val="Nmerodepgina"/>
             <w:noProof/>
           </w:rPr>
           <w:t>1</w:t>
         </w:r>
         <w:r>
           <w:rPr>
-            <w:rStyle w:val="PageNumber"/>
+            <w:rStyle w:val="Nmerodepgina"/>
           </w:rPr>
           <w:fldChar w:fldCharType="end"/>
         </w:r>
@@ -1500,7 +1634,7 @@
   </w:sdt>
   <w:p>
     <w:pPr>
-      <w:pStyle w:val="Footer"/>
+      <w:pStyle w:val="Piedepgina"/>
       <w:ind w:right="360"/>
     </w:pPr>
   </w:p>
@@ -1508,7 +1642,7 @@
 </file>
 
 <file path=word/footnotes.xml><?xml version="1.0" encoding="utf-8"?>
-<w:footnotes xmlns:wpc="http://schemas.microsoft.com/office/word/2010/wordprocessingCanvas" xmlns:cx="http://schemas.microsoft.com/office/drawing/2014/chartex" xmlns:cx1="http://schemas.microsoft.com/office/drawing/2015/9/8/chartex" xmlns:cx2="http://schemas.microsoft.com/office/drawing/2015/10/21/chartex" xmlns:cx3="http://schemas.microsoft.com/office/drawing/2016/5/9/chartex" xmlns:cx4="http://schemas.microsoft.com/office/drawing/2016/5/10/chartex" xmlns:cx5="http://schemas.microsoft.com/office/drawing/2016/5/11/chartex" xmlns:cx6="http://schemas.microsoft.com/office/drawing/2016/5/12/chartex" xmlns:cx7="http://schemas.microsoft.com/office/drawing/2016/5/13/chartex" xmlns:cx8="http://schemas.microsoft.com/office/drawing/2016/5/14/chartex" xmlns:mc="http://schemas.openxmlformats.org/markup-compatibility/2006" xmlns:aink="http://schemas.microsoft.com/office/drawing/2016/ink" xmlns:am3d="http://schemas.microsoft.com/office/drawing/2017/model3d" xmlns:o="urn:schemas-microsoft-com:office:office" xmlns:oel="http://schemas.microsoft.com/office/2019/extlst" xmlns:r="http://schemas.openxmlformats.org/officeDocument/2006/relationships" xmlns:m="http://schemas.openxmlformats.org/officeDocument/2006/math" xmlns:v="urn:schemas-microsoft-com:vml" xmlns:wp14="http://schemas.microsoft.com/office/word/2010/wordprocessingDrawing" xmlns:wp="http://schemas.openxmlformats.org/drawingml/2006/wordprocessingDrawing" xmlns:w10="urn:schemas-microsoft-com:office:word" xmlns:w="http://schemas.openxmlformats.org/wordprocessingml/2006/main" xmlns:w14="http://schemas.microsoft.com/office/word/2010/wordml" xmlns:w15="http://schemas.microsoft.com/office/word/2012/wordml" xmlns:w16cex="http://schemas.microsoft.com/office/word/2018/wordml/cex" xmlns:w16cid="http://schemas.microsoft.com/office/word/2016/wordml/cid" xmlns:w16="http://schemas.microsoft.com/office/word/2018/wordml" xmlns:w16du="http://schemas.microsoft.com/office/word/2023/wordml/word16du" xmlns:w16sdtdh="http://schemas.microsoft.com/office/word/2020/wordml/sdtdatahash" xmlns:w16sdtfl="http://schemas.microsoft.com/office/word/2024/wordml/sdtformatlock" xmlns:w16se="http://schemas.microsoft.com/office/word/2015/wordml/symex" xmlns:wpg="http://schemas.microsoft.com/office/word/2010/wordprocessingGroup" xmlns:wpi="http://schemas.microsoft.com/office/word/2010/wordprocessingInk" xmlns:wne="http://schemas.microsoft.com/office/word/2006/wordml" xmlns:wps="http://schemas.microsoft.com/office/word/2010/wordprocessingShape" mc:Ignorable="w14 w15 w16se w16cid w16 w16cex w16sdtdh w16sdtfl w16du wp14">
+<w:footnotes xmlns:wpc="http://schemas.microsoft.com/office/word/2010/wordprocessingCanvas" xmlns:cx="http://schemas.microsoft.com/office/drawing/2014/chartex" xmlns:cx1="http://schemas.microsoft.com/office/drawing/2015/9/8/chartex" xmlns:cx2="http://schemas.microsoft.com/office/drawing/2015/10/21/chartex" xmlns:cx3="http://schemas.microsoft.com/office/drawing/2016/5/9/chartex" xmlns:cx4="http://schemas.microsoft.com/office/drawing/2016/5/10/chartex" xmlns:cx5="http://schemas.microsoft.com/office/drawing/2016/5/11/chartex" xmlns:cx6="http://schemas.microsoft.com/office/drawing/2016/5/12/chartex" xmlns:cx7="http://schemas.microsoft.com/office/drawing/2016/5/13/chartex" xmlns:cx8="http://schemas.microsoft.com/office/drawing/2016/5/14/chartex" xmlns:mc="http://schemas.openxmlformats.org/markup-compatibility/2006" xmlns:aink="http://schemas.microsoft.com/office/drawing/2016/ink" xmlns:am3d="http://schemas.microsoft.com/office/drawing/2017/model3d" xmlns:o="urn:schemas-microsoft-com:office:office" xmlns:r="http://schemas.openxmlformats.org/officeDocument/2006/relationships" xmlns:m="http://schemas.openxmlformats.org/officeDocument/2006/math" xmlns:v="urn:schemas-microsoft-com:vml" xmlns:wp14="http://schemas.microsoft.com/office/word/2010/wordprocessingDrawing" xmlns:wp="http://schemas.openxmlformats.org/drawingml/2006/wordprocessingDrawing" xmlns:w10="urn:schemas-microsoft-com:office:word" xmlns:w="http://schemas.openxmlformats.org/wordprocessingml/2006/main" xmlns:w14="http://schemas.microsoft.com/office/word/2010/wordml" xmlns:w15="http://schemas.microsoft.com/office/word/2012/wordml" xmlns:w16cex="http://schemas.microsoft.com/office/word/2018/wordml/cex" xmlns:w16cid="http://schemas.microsoft.com/office/word/2016/wordml/cid" xmlns:w16="http://schemas.microsoft.com/office/word/2018/wordml" xmlns:w16sdtdh="http://schemas.microsoft.com/office/word/2020/wordml/sdtdatahash" xmlns:w16se="http://schemas.microsoft.com/office/word/2015/wordml/symex" xmlns:wpg="http://schemas.microsoft.com/office/word/2010/wordprocessingGroup" xmlns:wpi="http://schemas.microsoft.com/office/word/2010/wordprocessingInk" xmlns:wne="http://schemas.microsoft.com/office/word/2006/wordml" xmlns:wps="http://schemas.microsoft.com/office/word/2010/wordprocessingShape" mc:Ignorable="w14 w15 w16se w16cid w16 w16cex w16sdtdh wp14">
   <w:footnote w:type="separator" w:id="-1">
     <w:p>
       <w:r>
@@ -1527,7 +1661,7 @@
 </file>
 
 <file path=word/numbering.xml><?xml version="1.0" encoding="utf-8"?>
-<w:numbering xmlns:wpc="http://schemas.microsoft.com/office/word/2010/wordprocessingCanvas" xmlns:cx="http://schemas.microsoft.com/office/drawing/2014/chartex" xmlns:cx1="http://schemas.microsoft.com/office/drawing/2015/9/8/chartex" xmlns:cx2="http://schemas.microsoft.com/office/drawing/2015/10/21/chartex" xmlns:cx3="http://schemas.microsoft.com/office/drawing/2016/5/9/chartex" xmlns:cx4="http://schemas.microsoft.com/office/drawing/2016/5/10/chartex" xmlns:cx5="http://schemas.microsoft.com/office/drawing/2016/5/11/chartex" xmlns:cx6="http://schemas.microsoft.com/office/drawing/2016/5/12/chartex" xmlns:cx7="http://schemas.microsoft.com/office/drawing/2016/5/13/chartex" xmlns:cx8="http://schemas.microsoft.com/office/drawing/2016/5/14/chartex" xmlns:mc="http://schemas.openxmlformats.org/markup-compatibility/2006" xmlns:aink="http://schemas.microsoft.com/office/drawing/2016/ink" xmlns:am3d="http://schemas.microsoft.com/office/drawing/2017/model3d" xmlns:o="urn:schemas-microsoft-com:office:office" xmlns:oel="http://schemas.microsoft.com/office/2019/extlst" xmlns:r="http://schemas.openxmlformats.org/officeDocument/2006/relationships" xmlns:m="http://schemas.openxmlformats.org/officeDocument/2006/math" xmlns:v="urn:schemas-microsoft-com:vml" xmlns:wp14="http://schemas.microsoft.com/office/word/2010/wordprocessingDrawing" xmlns:wp="http://schemas.openxmlformats.org/drawingml/2006/wordprocessingDrawing" xmlns:w10="urn:schemas-microsoft-com:office:word" xmlns:w="http://schemas.openxmlformats.org/wordprocessingml/2006/main" xmlns:w14="http://schemas.microsoft.com/office/word/2010/wordml" xmlns:w15="http://schemas.microsoft.com/office/word/2012/wordml" xmlns:w16cex="http://schemas.microsoft.com/office/word/2018/wordml/cex" xmlns:w16cid="http://schemas.microsoft.com/office/word/2016/wordml/cid" xmlns:w16="http://schemas.microsoft.com/office/word/2018/wordml" xmlns:w16du="http://schemas.microsoft.com/office/word/2023/wordml/word16du" xmlns:w16sdtdh="http://schemas.microsoft.com/office/word/2020/wordml/sdtdatahash" xmlns:w16sdtfl="http://schemas.microsoft.com/office/word/2024/wordml/sdtformatlock" xmlns:w16se="http://schemas.microsoft.com/office/word/2015/wordml/symex" xmlns:wpg="http://schemas.microsoft.com/office/word/2010/wordprocessingGroup" xmlns:wpi="http://schemas.microsoft.com/office/word/2010/wordprocessingInk" xmlns:wne="http://schemas.microsoft.com/office/word/2006/wordml" xmlns:wps="http://schemas.microsoft.com/office/word/2010/wordprocessingShape" mc:Ignorable="w14 w15 w16se w16cid w16 w16cex w16sdtdh w16sdtfl w16du wp14">
+<w:numbering xmlns:wpc="http://schemas.microsoft.com/office/word/2010/wordprocessingCanvas" xmlns:cx="http://schemas.microsoft.com/office/drawing/2014/chartex" xmlns:cx1="http://schemas.microsoft.com/office/drawing/2015/9/8/chartex" xmlns:cx2="http://schemas.microsoft.com/office/drawing/2015/10/21/chartex" xmlns:cx3="http://schemas.microsoft.com/office/drawing/2016/5/9/chartex" xmlns:cx4="http://schemas.microsoft.com/office/drawing/2016/5/10/chartex" xmlns:cx5="http://schemas.microsoft.com/office/drawing/2016/5/11/chartex" xmlns:cx6="http://schemas.microsoft.com/office/drawing/2016/5/12/chartex" xmlns:cx7="http://schemas.microsoft.com/office/drawing/2016/5/13/chartex" xmlns:cx8="http://schemas.microsoft.com/office/drawing/2016/5/14/chartex" xmlns:mc="http://schemas.openxmlformats.org/markup-compatibility/2006" xmlns:aink="http://schemas.microsoft.com/office/drawing/2016/ink" xmlns:am3d="http://schemas.microsoft.com/office/drawing/2017/model3d" xmlns:o="urn:schemas-microsoft-com:office:office" xmlns:r="http://schemas.openxmlformats.org/officeDocument/2006/relationships" xmlns:m="http://schemas.openxmlformats.org/officeDocument/2006/math" xmlns:v="urn:schemas-microsoft-com:vml" xmlns:wp14="http://schemas.microsoft.com/office/word/2010/wordprocessingDrawing" xmlns:wp="http://schemas.openxmlformats.org/drawingml/2006/wordprocessingDrawing" xmlns:w10="urn:schemas-microsoft-com:office:word" xmlns:w="http://schemas.openxmlformats.org/wordprocessingml/2006/main" xmlns:w14="http://schemas.microsoft.com/office/word/2010/wordml" xmlns:w15="http://schemas.microsoft.com/office/word/2012/wordml" xmlns:w16cex="http://schemas.microsoft.com/office/word/2018/wordml/cex" xmlns:w16cid="http://schemas.microsoft.com/office/word/2016/wordml/cid" xmlns:w16="http://schemas.microsoft.com/office/word/2018/wordml" xmlns:w16sdtdh="http://schemas.microsoft.com/office/word/2020/wordml/sdtdatahash" xmlns:w16se="http://schemas.microsoft.com/office/word/2015/wordml/symex" xmlns:wpg="http://schemas.microsoft.com/office/word/2010/wordprocessingGroup" xmlns:wpi="http://schemas.microsoft.com/office/word/2010/wordprocessingInk" xmlns:wne="http://schemas.microsoft.com/office/word/2006/wordml" xmlns:wps="http://schemas.microsoft.com/office/word/2010/wordprocessingShape" mc:Ignorable="w14 w15 w16se w16cid w16 w16cex w16sdtdh wp14">
   <w:abstractNum w:abstractNumId="0" w15:restartNumberingAfterBreak="0">
     <w:nsid w:val="6BA156D2"/>
     <w:multiLevelType w:val="hybridMultilevel"/>
@@ -1618,14 +1752,14 @@
       </w:pPr>
     </w:lvl>
   </w:abstractNum>
-  <w:num w:numId="1" w16cid:durableId="1862930759">
+  <w:num w:numId="1">
     <w:abstractNumId w:val="0"/>
   </w:num>
 </w:numbering>
 </file>
 
 <file path=word/styles.xml><?xml version="1.0" encoding="utf-8"?>
-<w:styles xmlns:mc="http://schemas.openxmlformats.org/markup-compatibility/2006" xmlns:r="http://schemas.openxmlformats.org/officeDocument/2006/relationships" xmlns:w="http://schemas.openxmlformats.org/wordprocessingml/2006/main" xmlns:w14="http://schemas.microsoft.com/office/word/2010/wordml" xmlns:w15="http://schemas.microsoft.com/office/word/2012/wordml" xmlns:w16cex="http://schemas.microsoft.com/office/word/2018/wordml/cex" xmlns:w16cid="http://schemas.microsoft.com/office/word/2016/wordml/cid" xmlns:w16="http://schemas.microsoft.com/office/word/2018/wordml" xmlns:w16du="http://schemas.microsoft.com/office/word/2023/wordml/word16du" xmlns:w16sdtdh="http://schemas.microsoft.com/office/word/2020/wordml/sdtdatahash" xmlns:w16sdtfl="http://schemas.microsoft.com/office/word/2024/wordml/sdtformatlock" xmlns:w16se="http://schemas.microsoft.com/office/word/2015/wordml/symex" mc:Ignorable="w14 w15 w16se w16cid w16 w16cex w16sdtdh w16sdtfl w16du">
+<w:styles xmlns:mc="http://schemas.openxmlformats.org/markup-compatibility/2006" xmlns:r="http://schemas.openxmlformats.org/officeDocument/2006/relationships" xmlns:w="http://schemas.openxmlformats.org/wordprocessingml/2006/main" xmlns:w14="http://schemas.microsoft.com/office/word/2010/wordml" xmlns:w15="http://schemas.microsoft.com/office/word/2012/wordml" xmlns:w16cex="http://schemas.microsoft.com/office/word/2018/wordml/cex" xmlns:w16cid="http://schemas.microsoft.com/office/word/2016/wordml/cid" xmlns:w16="http://schemas.microsoft.com/office/word/2018/wordml" xmlns:w16sdtdh="http://schemas.microsoft.com/office/word/2020/wordml/sdtdatahash" xmlns:w16se="http://schemas.microsoft.com/office/word/2015/wordml/symex" mc:Ignorable="w14 w15 w16se w16cid w16 w16cex w16sdtdh">
   <w:docDefaults>
     <w:rPrDefault>
       <w:rPr>
@@ -2019,11 +2153,11 @@
     <w:name w:val="Normal"/>
     <w:qFormat/>
   </w:style>
-  <w:style w:type="paragraph" w:styleId="Heading1">
+  <w:style w:type="paragraph" w:styleId="Ttulo1">
     <w:name w:val="heading 1"/>
     <w:basedOn w:val="Normal"/>
     <w:next w:val="Normal"/>
-    <w:link w:val="Heading1Char"/>
+    <w:link w:val="Ttulo1Car"/>
     <w:uiPriority w:val="9"/>
     <w:qFormat/>
     <w:rsid w:val="00C871DA"/>
@@ -2040,13 +2174,13 @@
       <w:szCs w:val="32"/>
     </w:rPr>
   </w:style>
-  <w:style w:type="character" w:default="1" w:styleId="DefaultParagraphFont">
+  <w:style w:type="character" w:default="1" w:styleId="Fuentedeprrafopredeter">
     <w:name w:val="Default Paragraph Font"/>
     <w:uiPriority w:val="1"/>
     <w:semiHidden/>
     <w:unhideWhenUsed/>
   </w:style>
-  <w:style w:type="table" w:default="1" w:styleId="TableNormal">
+  <w:style w:type="table" w:default="1" w:styleId="Tablanormal">
     <w:name w:val="Normal Table"/>
     <w:uiPriority w:val="99"/>
     <w:semiHidden/>
@@ -2061,7 +2195,7 @@
       </w:tblCellMar>
     </w:tblPr>
   </w:style>
-  <w:style w:type="numbering" w:default="1" w:styleId="NoList">
+  <w:style w:type="numbering" w:default="1" w:styleId="Sinlista">
     <w:name w:val="No List"/>
     <w:uiPriority w:val="99"/>
     <w:semiHidden/>
@@ -2081,10 +2215,10 @@
       <w:lang w:eastAsia="es-MX"/>
     </w:rPr>
   </w:style>
-  <w:style w:type="paragraph" w:styleId="Footer">
+  <w:style w:type="paragraph" w:styleId="Piedepgina">
     <w:name w:val="footer"/>
     <w:basedOn w:val="Normal"/>
-    <w:link w:val="FooterChar"/>
+    <w:link w:val="PiedepginaCar"/>
     <w:uiPriority w:val="99"/>
     <w:unhideWhenUsed/>
     <w:rsid w:val="00F8070E"/>
@@ -2095,25 +2229,25 @@
       </w:tabs>
     </w:pPr>
   </w:style>
-  <w:style w:type="character" w:customStyle="1" w:styleId="FooterChar">
-    <w:name w:val="Footer Char"/>
-    <w:basedOn w:val="DefaultParagraphFont"/>
-    <w:link w:val="Footer"/>
+  <w:style w:type="character" w:customStyle="1" w:styleId="PiedepginaCar">
+    <w:name w:val="Pie de página Car"/>
+    <w:basedOn w:val="Fuentedeprrafopredeter"/>
+    <w:link w:val="Piedepgina"/>
     <w:uiPriority w:val="99"/>
     <w:rsid w:val="00F8070E"/>
   </w:style>
-  <w:style w:type="character" w:styleId="PageNumber">
+  <w:style w:type="character" w:styleId="Nmerodepgina">
     <w:name w:val="page number"/>
-    <w:basedOn w:val="DefaultParagraphFont"/>
+    <w:basedOn w:val="Fuentedeprrafopredeter"/>
     <w:uiPriority w:val="99"/>
     <w:semiHidden/>
     <w:unhideWhenUsed/>
     <w:rsid w:val="00F8070E"/>
   </w:style>
-  <w:style w:type="paragraph" w:styleId="ListParagraph">
+  <w:style w:type="paragraph" w:styleId="Prrafodelista">
     <w:name w:val="List Paragraph"/>
     <w:basedOn w:val="Normal"/>
-    <w:link w:val="ListParagraphChar"/>
+    <w:link w:val="PrrafodelistaCar"/>
     <w:uiPriority w:val="34"/>
     <w:qFormat/>
     <w:rsid w:val="00C10B76"/>
@@ -2122,10 +2256,10 @@
       <w:contextualSpacing/>
     </w:pPr>
   </w:style>
-  <w:style w:type="character" w:customStyle="1" w:styleId="Heading1Char">
-    <w:name w:val="Heading 1 Char"/>
-    <w:basedOn w:val="DefaultParagraphFont"/>
-    <w:link w:val="Heading1"/>
+  <w:style w:type="character" w:customStyle="1" w:styleId="Ttulo1Car">
+    <w:name w:val="Título 1 Car"/>
+    <w:basedOn w:val="Fuentedeprrafopredeter"/>
+    <w:link w:val="Ttulo1"/>
     <w:uiPriority w:val="9"/>
     <w:rsid w:val="00C871DA"/>
     <w:rPr>
@@ -2135,9 +2269,9 @@
       <w:szCs w:val="32"/>
     </w:rPr>
   </w:style>
-  <w:style w:type="paragraph" w:styleId="TOCHeading">
+  <w:style w:type="paragraph" w:styleId="TtuloTDC">
     <w:name w:val="TOC Heading"/>
-    <w:basedOn w:val="Heading1"/>
+    <w:basedOn w:val="Ttulo1"/>
     <w:next w:val="Normal"/>
     <w:uiPriority w:val="39"/>
     <w:unhideWhenUsed/>
@@ -2153,7 +2287,7 @@
   </w:style>
   <w:style w:type="paragraph" w:customStyle="1" w:styleId="Style1">
     <w:name w:val="Style1"/>
-    <w:basedOn w:val="ListParagraph"/>
+    <w:basedOn w:val="Prrafodelista"/>
     <w:link w:val="Style1Char"/>
     <w:qFormat/>
     <w:rsid w:val="00C871DA"/>
@@ -2169,16 +2303,16 @@
       <w:szCs w:val="40"/>
     </w:rPr>
   </w:style>
-  <w:style w:type="character" w:customStyle="1" w:styleId="ListParagraphChar">
-    <w:name w:val="List Paragraph Char"/>
-    <w:basedOn w:val="DefaultParagraphFont"/>
-    <w:link w:val="ListParagraph"/>
+  <w:style w:type="character" w:customStyle="1" w:styleId="PrrafodelistaCar">
+    <w:name w:val="Párrafo de lista Car"/>
+    <w:basedOn w:val="Fuentedeprrafopredeter"/>
+    <w:link w:val="Prrafodelista"/>
     <w:uiPriority w:val="34"/>
     <w:rsid w:val="00C871DA"/>
   </w:style>
   <w:style w:type="character" w:customStyle="1" w:styleId="Style1Char">
     <w:name w:val="Style1 Char"/>
-    <w:basedOn w:val="ListParagraphChar"/>
+    <w:basedOn w:val="PrrafodelistaCar"/>
     <w:link w:val="Style1"/>
     <w:rsid w:val="00C871DA"/>
     <w:rPr>
@@ -2188,7 +2322,7 @@
       <w:szCs w:val="40"/>
     </w:rPr>
   </w:style>
-  <w:style w:type="paragraph" w:styleId="TOC2">
+  <w:style w:type="paragraph" w:styleId="TDC2">
     <w:name w:val="toc 2"/>
     <w:basedOn w:val="Normal"/>
     <w:next w:val="Normal"/>
@@ -2207,7 +2341,7 @@
       <w:lang w:val="en-US"/>
     </w:rPr>
   </w:style>
-  <w:style w:type="paragraph" w:styleId="TOC1">
+  <w:style w:type="paragraph" w:styleId="TDC1">
     <w:name w:val="toc 1"/>
     <w:basedOn w:val="Normal"/>
     <w:next w:val="Normal"/>
@@ -2225,7 +2359,7 @@
       <w:lang w:val="en-US"/>
     </w:rPr>
   </w:style>
-  <w:style w:type="paragraph" w:styleId="TOC3">
+  <w:style w:type="paragraph" w:styleId="TDC3">
     <w:name w:val="toc 3"/>
     <w:basedOn w:val="Normal"/>
     <w:next w:val="Normal"/>

</xml_diff>